<commit_message>
Use built-in PoGoskill HTML contracts without old article input
</commit_message>
<xml_diff>
--- a/docs/PoGoskill 文章助手同事使用指南.docx
+++ b/docs/PoGoskill 文章助手同事使用指南.docx
@@ -92,10 +92,10 @@
         <w:rPr>
           <w:b/>
         </w:rPr>
-        <w:t>参考样式：</w:t>
+        <w:t>固定规范：</w:t>
       </w:r>
       <w:r>
-        <w:t>在 DOCX 开头提供一篇旧文章的 URL、CMS 页面 ID，或可复制的旧 HTML，至少一种。AI 会按既有模板学习结构，不能自行发明新的框体、CSS 或模块。</w:t>
+        <w:t>繁中站的 Luna HTML 手册、英文站的 HTML 契约，以及下载区、Buy Box、图片盒等组件已内置在助手中。不需要提供旧文章 URL、CMS 页面 ID、CSS 或 HTML；AI 会直接按对应站点的固定规范制作。</w:t>
       </w:r>
     </w:p>
     <w:p>

</xml_diff>

<commit_message>
Explain Mac Keychain recovery in PoGoskill manual
</commit_message>
<xml_diff>
--- a/docs/PoGoskill 文章助手同事使用指南.docx
+++ b/docs/PoGoskill 文章助手同事使用指南.docx
@@ -66,7 +66,25 @@
     </w:p>
     <w:p>
       <w:r>
-        <w:t>如果 AI 说需要 Key：等它打开可见终端并显示等待提示后，复制管理员给你的完整 Key；回到同一个终端，只按 Enter。不要在终端里粘贴，也不要在聊天里发送 Key。随后要求 AI 实际检查凭据和 CMS 只读连接。</w:t>
+        <w:t>如果 AI 说需要 Key，先确认它已经打开独立的 macOS Terminal.app（Windows 为可见终端）并显示等待提示。复制 Key 到剪贴板，回到同一个窗口只按 Enter；不要把 Key 粘贴到聊天。保存窗口显示“已保存并验证”后，不要重复输入 Key。</w:t>
+      </w:r>
+    </w:p>
+    <w:p>
+      <w:pPr>
+        <w:pStyle w:val="Heading2"/>
+      </w:pPr>
+      <w:r>
+        <w:t>Mac 显示已保存但 Codex 找不到 Key</w:t>
+      </w:r>
+    </w:p>
+    <w:p>
+      <w:r>
+        <w:t>这通常是 Codex 内的 Keychain 读取失败，不等于 Key 没保存，也不等于 CMS 拒绝访问。请让 AI 先更新 PoGoskill 插件到最新版本，再运行当前插件的 check-key 和只读 /cms/site/list；新版在旧 Keychain 接口返回 status=-50 时会尝试系统 security 读取。不要再次复制 Key，也不要向 AI 发送 Key。</w:t>
+      </w:r>
+    </w:p>
+    <w:p>
+      <w:r>
+        <w:t>可直接发给 AI：请先更新 PoGoskill 独立助手，使用当前插件脚本检查已保存的 CMS Key，并只读测试 /cms/site/list。系统 Terminal 已显示保存并验证成功；不要让我重填 Key。若仍失败，只报告脚本路径、Keychain 旧接口状态、security 读取退出码，或脱敏的 HTTP 状态、code、msg、request_id；绝不显示 Key。</w:t>
       </w:r>
     </w:p>
     <w:p>

</xml_diff>